<commit_message>
17 Sep 2026: Hildesheim ledger revised (19 stops, APA 7 sources), outline, fact sheets with reading list
</commit_message>
<xml_diff>
--- a/hildesheim-seminar-fact-sheets-27-november-2026.docx
+++ b/hildesheim-seminar-fact-sheets-27-november-2026.docx
@@ -81,7 +81,7 @@
           <w:i w:val="0"/>
           <w:color w:val="000000"/>
         </w:rPr>
-        <w:t xml:space="preserve">West Germany recruited about 14 million workers between 1955 and 1973. Who benefited more, the receiving country or the sending countries, and who decided the terms?</w:t>
+        <w:t xml:space="preserve">About 14 million people came to work in West Germany between 1955 and 1973. Who benefited more: West Germany, the sending governments, or the families? And who decided the terms?</w:t>
       </w:r>
     </w:p>
     <w:p>
@@ -335,7 +335,7 @@
           <w:i w:val="0"/>
           <w:color w:val="000000"/>
         </w:rPr>
-        <w:t xml:space="preserve">You have twelve minutes. Use the facts on this page and what you already know about this history. Choose one person to report for two minutes.</w:t>
+        <w:t xml:space="preserve">You have twelve minutes. Use the facts on this sheet and what you already know about this history. Choose one person to report for two minutes.</w:t>
       </w:r>
     </w:p>
     <w:p>
@@ -357,7 +357,8 @@
     </w:p>
     <w:p>
       <w:pPr>
-        <w:spacing w:after="80" w:line="264" w:lineRule="auto"/>
+        <w:spacing w:after="40" w:line="264" w:lineRule="auto"/>
+        <w:ind w:left="567" w:hanging="567"/>
       </w:pPr>
       <w:r>
         <w:rPr>
@@ -365,13 +366,38 @@
           <w:b w:val="0"/>
           <w:i w:val="0"/>
           <w:color w:val="000000"/>
+          <w:sz w:val="19"/>
+          <w:szCs w:val="19"/>
         </w:rPr>
-        <w:t xml:space="preserve">bpb (2020) Erstes Anwerbeabkommen vor 65 Jahren. https://www.bpb.de/kurz-knapp/hintergrund-aktuell/324552/erstes-anwerbeabkommen-vor-65-jahren/</w:t>
+        <w:t xml:space="preserve">Bundeszentrale für politische Bildung. (2020, December 17). </w:t>
+      </w:r>
+      <w:r>
+        <w:rPr>
+          <w:rFonts w:ascii="Times New Roman" w:hAnsi="Times New Roman" w:cs="Times New Roman"/>
+          <w:b w:val="0"/>
+          <w:i/>
+          <w:color w:val="000000"/>
+          <w:sz w:val="19"/>
+          <w:szCs w:val="19"/>
+        </w:rPr>
+        <w:t xml:space="preserve">Erstes Anwerbeabkommen vor 65 Jahren</w:t>
+      </w:r>
+      <w:r>
+        <w:rPr>
+          <w:rFonts w:ascii="Times New Roman" w:hAnsi="Times New Roman" w:cs="Times New Roman"/>
+          <w:b w:val="0"/>
+          <w:i w:val="0"/>
+          <w:color w:val="000000"/>
+          <w:sz w:val="19"/>
+          <w:szCs w:val="19"/>
+        </w:rPr>
+        <w:t xml:space="preserve"> [The first recruitment agreement 65 years ago]. https://www.bpb.de/kurz-knapp/hintergrund-aktuell/324552/erstes-anwerbeabkommen-vor-65-jahren/</w:t>
       </w:r>
     </w:p>
     <w:p>
       <w:pPr>
-        <w:spacing w:after="80" w:line="264" w:lineRule="auto"/>
+        <w:spacing w:after="40" w:line="264" w:lineRule="auto"/>
+        <w:ind w:left="567" w:hanging="567"/>
       </w:pPr>
       <w:r>
         <w:rPr>
@@ -379,13 +405,38 @@
           <w:b w:val="0"/>
           <w:i w:val="0"/>
           <w:color w:val="000000"/>
+          <w:sz w:val="19"/>
+          <w:szCs w:val="19"/>
         </w:rPr>
-        <w:t xml:space="preserve">bpb, Anwerbestopp 1973. https://www.bpb.de/themen/migration-integration/anwerbeabkommen/43270/anwerbestopp-1973/</w:t>
+        <w:t xml:space="preserve">Bundeszentrale für politische Bildung. (2011, November 9). </w:t>
+      </w:r>
+      <w:r>
+        <w:rPr>
+          <w:rFonts w:ascii="Times New Roman" w:hAnsi="Times New Roman" w:cs="Times New Roman"/>
+          <w:b w:val="0"/>
+          <w:i/>
+          <w:color w:val="000000"/>
+          <w:sz w:val="19"/>
+          <w:szCs w:val="19"/>
+        </w:rPr>
+        <w:t xml:space="preserve">Anwerbestopp 1973</w:t>
+      </w:r>
+      <w:r>
+        <w:rPr>
+          <w:rFonts w:ascii="Times New Roman" w:hAnsi="Times New Roman" w:cs="Times New Roman"/>
+          <w:b w:val="0"/>
+          <w:i w:val="0"/>
+          <w:color w:val="000000"/>
+          <w:sz w:val="19"/>
+          <w:szCs w:val="19"/>
+        </w:rPr>
+        <w:t xml:space="preserve"> [The 1973 recruitment stop]. https://www.bpb.de/themen/migration-integration/anwerbeabkommen/43270/anwerbestopp-1973/</w:t>
       </w:r>
     </w:p>
     <w:p>
       <w:pPr>
-        <w:spacing w:after="80" w:line="264" w:lineRule="auto"/>
+        <w:spacing w:after="40" w:line="264" w:lineRule="auto"/>
+        <w:ind w:left="567" w:hanging="567"/>
       </w:pPr>
       <w:r>
         <w:rPr>
@@ -393,8 +444,32 @@
           <w:b w:val="0"/>
           <w:i w:val="0"/>
           <w:color w:val="000000"/>
+          <w:sz w:val="19"/>
+          <w:szCs w:val="19"/>
         </w:rPr>
-        <w:t xml:space="preserve">bpb, Die Anwerbung türkischer Arbeitnehmer und ihre Folgen. https://www.bpb.de/themen/europa/tuerkei/184981/die-anwerbung-tuerkischer-arbeitnehmer-und-ihre-folgen/</w:t>
+        <w:t xml:space="preserve">Luft, S. (2014, August 5). </w:t>
+      </w:r>
+      <w:r>
+        <w:rPr>
+          <w:rFonts w:ascii="Times New Roman" w:hAnsi="Times New Roman" w:cs="Times New Roman"/>
+          <w:b w:val="0"/>
+          <w:i/>
+          <w:color w:val="000000"/>
+          <w:sz w:val="19"/>
+          <w:szCs w:val="19"/>
+        </w:rPr>
+        <w:t xml:space="preserve">Die Anwerbung türkischer Arbeitnehmer und ihre Folgen</w:t>
+      </w:r>
+      <w:r>
+        <w:rPr>
+          <w:rFonts w:ascii="Times New Roman" w:hAnsi="Times New Roman" w:cs="Times New Roman"/>
+          <w:b w:val="0"/>
+          <w:i w:val="0"/>
+          <w:color w:val="000000"/>
+          <w:sz w:val="19"/>
+          <w:szCs w:val="19"/>
+        </w:rPr>
+        <w:t xml:space="preserve"> [The recruitment of Turkish workers and its consequences]. Bundeszentrale für politische Bildung. https://www.bpb.de/themen/europa/tuerkei/184981/die-anwerbung-tuerkischer-arbeitnehmer-und-ihre-folgen/</w:t>
       </w:r>
     </w:p>
     <w:p>
@@ -477,7 +552,7 @@
           <w:i w:val="0"/>
           <w:color w:val="000000"/>
         </w:rPr>
-        <w:t xml:space="preserve">West Germany recruited about 14 million workers between 1955 and 1973. Who benefited more, the receiving country or the sending countries, and who decided the terms?</w:t>
+        <w:t xml:space="preserve">About 14 million people came to work in West Germany between 1955 and 1973. Who benefited more: West Germany, the sending governments, or the families? And who decided the terms?</w:t>
       </w:r>
     </w:p>
     <w:p>
@@ -786,7 +861,7 @@
           <w:i w:val="0"/>
           <w:color w:val="000000"/>
         </w:rPr>
-        <w:t xml:space="preserve">You have twelve minutes. Use the facts on this page and what you already know about this history. Choose one person to report for two minutes.</w:t>
+        <w:t xml:space="preserve">You have twelve minutes. Use the facts on this sheet and what you already know about this history. Choose one person to report for two minutes.</w:t>
       </w:r>
     </w:p>
     <w:p>
@@ -808,7 +883,8 @@
     </w:p>
     <w:p>
       <w:pPr>
-        <w:spacing w:after="80" w:line="264" w:lineRule="auto"/>
+        <w:spacing w:after="40" w:line="264" w:lineRule="auto"/>
+        <w:ind w:left="567" w:hanging="567"/>
       </w:pPr>
       <w:r>
         <w:rPr>
@@ -816,13 +892,38 @@
           <w:b w:val="0"/>
           <w:i w:val="0"/>
           <w:color w:val="000000"/>
+          <w:sz w:val="19"/>
+          <w:szCs w:val="19"/>
         </w:rPr>
-        <w:t xml:space="preserve">bpb, Die Anwerbung türkischer Arbeitnehmer und ihre Folgen. https://www.bpb.de/themen/europa/tuerkei/184981/die-anwerbung-tuerkischer-arbeitnehmer-und-ihre-folgen/</w:t>
+        <w:t xml:space="preserve">Luft, S. (2014, August 5). </w:t>
+      </w:r>
+      <w:r>
+        <w:rPr>
+          <w:rFonts w:ascii="Times New Roman" w:hAnsi="Times New Roman" w:cs="Times New Roman"/>
+          <w:b w:val="0"/>
+          <w:i/>
+          <w:color w:val="000000"/>
+          <w:sz w:val="19"/>
+          <w:szCs w:val="19"/>
+        </w:rPr>
+        <w:t xml:space="preserve">Die Anwerbung türkischer Arbeitnehmer und ihre Folgen</w:t>
+      </w:r>
+      <w:r>
+        <w:rPr>
+          <w:rFonts w:ascii="Times New Roman" w:hAnsi="Times New Roman" w:cs="Times New Roman"/>
+          <w:b w:val="0"/>
+          <w:i w:val="0"/>
+          <w:color w:val="000000"/>
+          <w:sz w:val="19"/>
+          <w:szCs w:val="19"/>
+        </w:rPr>
+        <w:t xml:space="preserve"> [The recruitment of Turkish workers and its consequences]. Bundeszentrale für politische Bildung. https://www.bpb.de/themen/europa/tuerkei/184981/die-anwerbung-tuerkischer-arbeitnehmer-und-ihre-folgen/</w:t>
       </w:r>
     </w:p>
     <w:p>
       <w:pPr>
-        <w:spacing w:after="80" w:line="264" w:lineRule="auto"/>
+        <w:spacing w:after="40" w:line="264" w:lineRule="auto"/>
+        <w:ind w:left="567" w:hanging="567"/>
       </w:pPr>
       <w:r>
         <w:rPr>
@@ -830,8 +931,32 @@
           <w:b w:val="0"/>
           <w:i w:val="0"/>
           <w:color w:val="000000"/>
+          <w:sz w:val="19"/>
+          <w:szCs w:val="19"/>
         </w:rPr>
-        <w:t xml:space="preserve">bpb, Anwerbestopp 1973. https://www.bpb.de/themen/migration-integration/anwerbeabkommen/43270/anwerbestopp-1973/</w:t>
+        <w:t xml:space="preserve">Bundeszentrale für politische Bildung. (2011, November 9). </w:t>
+      </w:r>
+      <w:r>
+        <w:rPr>
+          <w:rFonts w:ascii="Times New Roman" w:hAnsi="Times New Roman" w:cs="Times New Roman"/>
+          <w:b w:val="0"/>
+          <w:i/>
+          <w:color w:val="000000"/>
+          <w:sz w:val="19"/>
+          <w:szCs w:val="19"/>
+        </w:rPr>
+        <w:t xml:space="preserve">Anwerbestopp 1973</w:t>
+      </w:r>
+      <w:r>
+        <w:rPr>
+          <w:rFonts w:ascii="Times New Roman" w:hAnsi="Times New Roman" w:cs="Times New Roman"/>
+          <w:b w:val="0"/>
+          <w:i w:val="0"/>
+          <w:color w:val="000000"/>
+          <w:sz w:val="19"/>
+          <w:szCs w:val="19"/>
+        </w:rPr>
+        <w:t xml:space="preserve"> [The 1973 recruitment stop]. https://www.bpb.de/themen/migration-integration/anwerbeabkommen/43270/anwerbestopp-1973/</w:t>
       </w:r>
     </w:p>
     <w:p>
@@ -914,7 +1039,7 @@
           <w:i w:val="0"/>
           <w:color w:val="000000"/>
         </w:rPr>
-        <w:t xml:space="preserve">West Germany recruited about 14 million workers between 1955 and 1973. Who benefited more, the receiving country or the sending countries, and who decided the terms?</w:t>
+        <w:t xml:space="preserve">About 14 million people came to work in West Germany between 1955 and 1973. Who benefited more: West Germany, the sending governments, or the families? And who decided the terms?</w:t>
       </w:r>
     </w:p>
     <w:p>
@@ -1100,7 +1225,7 @@
           <w:i w:val="0"/>
           <w:color w:val="000000"/>
         </w:rPr>
-        <w:t xml:space="preserve">The number of women from Turkey living in West Germany rose by about 21%, and the number of children under 15 doubled, to about 420,000.</w:t>
+        <w:t xml:space="preserve">The proportion of women among people from Turkey in West Germany grew by about 21%, and the number of children under 15 doubled, to about 420,000.</w:t>
       </w:r>
     </w:p>
     <w:p>
@@ -1200,7 +1325,7 @@
           <w:i w:val="0"/>
           <w:color w:val="000000"/>
         </w:rPr>
-        <w:t xml:space="preserve">You have twelve minutes. Use the facts on this page and what you already know about this history. Choose one person to report for two minutes.</w:t>
+        <w:t xml:space="preserve">You have twelve minutes. Use the facts on this sheet and what you already know about this history. Choose one person to report for two minutes.</w:t>
       </w:r>
     </w:p>
     <w:p>
@@ -1222,7 +1347,155 @@
     </w:p>
     <w:p>
       <w:pPr>
-        <w:spacing w:after="80" w:line="264" w:lineRule="auto"/>
+        <w:spacing w:after="40" w:line="264" w:lineRule="auto"/>
+        <w:ind w:left="567" w:hanging="567"/>
+      </w:pPr>
+      <w:r>
+        <w:rPr>
+          <w:rFonts w:ascii="Times New Roman" w:hAnsi="Times New Roman" w:cs="Times New Roman"/>
+          <w:b w:val="0"/>
+          <w:i w:val="0"/>
+          <w:color w:val="000000"/>
+          <w:sz w:val="19"/>
+          <w:szCs w:val="19"/>
+        </w:rPr>
+        <w:t xml:space="preserve">Luft, S. (2014, August 5). </w:t>
+      </w:r>
+      <w:r>
+        <w:rPr>
+          <w:rFonts w:ascii="Times New Roman" w:hAnsi="Times New Roman" w:cs="Times New Roman"/>
+          <w:b w:val="0"/>
+          <w:i/>
+          <w:color w:val="000000"/>
+          <w:sz w:val="19"/>
+          <w:szCs w:val="19"/>
+        </w:rPr>
+        <w:t xml:space="preserve">Die Anwerbung türkischer Arbeitnehmer und ihre Folgen</w:t>
+      </w:r>
+      <w:r>
+        <w:rPr>
+          <w:rFonts w:ascii="Times New Roman" w:hAnsi="Times New Roman" w:cs="Times New Roman"/>
+          <w:b w:val="0"/>
+          <w:i w:val="0"/>
+          <w:color w:val="000000"/>
+          <w:sz w:val="19"/>
+          <w:szCs w:val="19"/>
+        </w:rPr>
+        <w:t xml:space="preserve"> [The recruitment of Turkish workers and its consequences]. Bundeszentrale für politische Bildung. https://www.bpb.de/themen/europa/tuerkei/184981/die-anwerbung-tuerkischer-arbeitnehmer-und-ihre-folgen/</w:t>
+      </w:r>
+    </w:p>
+    <w:p>
+      <w:pPr>
+        <w:spacing w:after="40" w:line="264" w:lineRule="auto"/>
+        <w:ind w:left="567" w:hanging="567"/>
+      </w:pPr>
+      <w:r>
+        <w:rPr>
+          <w:rFonts w:ascii="Times New Roman" w:hAnsi="Times New Roman" w:cs="Times New Roman"/>
+          <w:b w:val="0"/>
+          <w:i w:val="0"/>
+          <w:color w:val="000000"/>
+          <w:sz w:val="19"/>
+          <w:szCs w:val="19"/>
+        </w:rPr>
+        <w:t xml:space="preserve">Bundeszentrale für politische Bildung. (2011, November 9). </w:t>
+      </w:r>
+      <w:r>
+        <w:rPr>
+          <w:rFonts w:ascii="Times New Roman" w:hAnsi="Times New Roman" w:cs="Times New Roman"/>
+          <w:b w:val="0"/>
+          <w:i/>
+          <w:color w:val="000000"/>
+          <w:sz w:val="19"/>
+          <w:szCs w:val="19"/>
+        </w:rPr>
+        <w:t xml:space="preserve">Anwerbestopp 1973</w:t>
+      </w:r>
+      <w:r>
+        <w:rPr>
+          <w:rFonts w:ascii="Times New Roman" w:hAnsi="Times New Roman" w:cs="Times New Roman"/>
+          <w:b w:val="0"/>
+          <w:i w:val="0"/>
+          <w:color w:val="000000"/>
+          <w:sz w:val="19"/>
+          <w:szCs w:val="19"/>
+        </w:rPr>
+        <w:t xml:space="preserve"> [The 1973 recruitment stop]. https://www.bpb.de/themen/migration-integration/anwerbeabkommen/43270/anwerbestopp-1973/</w:t>
+      </w:r>
+    </w:p>
+    <w:p>
+      <w:pPr>
+        <w:pageBreakBefore/>
+        <w:spacing w:after="40" w:line="264" w:lineRule="auto"/>
+        <w:jc w:val="center"/>
+      </w:pPr>
+      <w:r>
+        <w:rPr>
+          <w:rFonts w:ascii="Times New Roman" w:hAnsi="Times New Roman" w:cs="Times New Roman"/>
+          <w:b/>
+          <w:i w:val="0"/>
+          <w:color w:val="000000"/>
+          <w:sz w:val="32"/>
+          <w:szCs w:val="32"/>
+        </w:rPr>
+        <w:t xml:space="preserve">Reading list</w:t>
+      </w:r>
+    </w:p>
+    <w:p>
+      <w:pPr>
+        <w:spacing w:after="120" w:line="264" w:lineRule="auto"/>
+        <w:jc w:val="center"/>
+      </w:pPr>
+      <w:r>
+        <w:rPr>
+          <w:rFonts w:ascii="Times New Roman" w:hAnsi="Times New Roman" w:cs="Times New Roman"/>
+          <w:b w:val="0"/>
+          <w:i/>
+          <w:color w:val="000000"/>
+          <w:sz w:val="24"/>
+          <w:szCs w:val="24"/>
+        </w:rPr>
+        <w:t xml:space="preserve">Sources used in the seminar, in APA 7 style</w:t>
+      </w:r>
+    </w:p>
+    <w:p>
+      <w:pPr>
+        <w:spacing w:after="200" w:line="264" w:lineRule="auto"/>
+        <w:jc w:val="center"/>
+      </w:pPr>
+      <w:r>
+        <w:rPr>
+          <w:rFonts w:ascii="Times New Roman" w:hAnsi="Times New Roman" w:cs="Times New Roman"/>
+          <w:b w:val="0"/>
+          <w:i w:val="0"/>
+          <w:color w:val="000000"/>
+          <w:sz w:val="21"/>
+          <w:szCs w:val="21"/>
+        </w:rPr>
+        <w:t xml:space="preserve">Aid, remittances and agency in small island states: the cases of Malta and Jamaica. University of Hildesheim, 27 November 2026.</w:t>
+      </w:r>
+    </w:p>
+    <w:p>
+      <w:pPr>
+        <w:spacing w:after="80" w:line="264" w:lineRule="auto" w:before="200"/>
+        <w:keepNext/>
+      </w:pPr>
+      <w:r>
+        <w:rPr>
+          <w:rFonts w:ascii="Times New Roman" w:hAnsi="Times New Roman" w:cs="Times New Roman"/>
+          <w:b/>
+          <w:i w:val="0"/>
+          <w:color w:val="000000"/>
+          <w:sz w:val="26"/>
+          <w:szCs w:val="26"/>
+        </w:rPr>
+        <w:t xml:space="preserve">Malta</w:t>
+      </w:r>
+    </w:p>
+    <w:p>
+      <w:pPr>
+        <w:spacing w:after="100" w:line="264" w:lineRule="auto"/>
+        <w:ind w:left="567" w:hanging="567"/>
       </w:pPr>
       <w:r>
         <w:rPr>
@@ -1231,12 +1504,31 @@
           <w:i w:val="0"/>
           <w:color w:val="000000"/>
         </w:rPr>
-        <w:t xml:space="preserve">bpb, Die Anwerbung türkischer Arbeitnehmer und ihre Folgen. https://www.bpb.de/themen/europa/tuerkei/184981/die-anwerbung-tuerkischer-arbeitnehmer-und-ihre-folgen/</w:t>
+        <w:t xml:space="preserve">Smith, S. C. (2007). Integration and disintegration: The attempted incorporation of Malta into the United Kingdom in the 1950s. </w:t>
+      </w:r>
+      <w:r>
+        <w:rPr>
+          <w:rFonts w:ascii="Times New Roman" w:hAnsi="Times New Roman" w:cs="Times New Roman"/>
+          <w:b w:val="0"/>
+          <w:i/>
+          <w:color w:val="000000"/>
+        </w:rPr>
+        <w:t xml:space="preserve">The Journal of Imperial and Commonwealth History, 35</w:t>
+      </w:r>
+      <w:r>
+        <w:rPr>
+          <w:rFonts w:ascii="Times New Roman" w:hAnsi="Times New Roman" w:cs="Times New Roman"/>
+          <w:b w:val="0"/>
+          <w:i w:val="0"/>
+          <w:color w:val="000000"/>
+        </w:rPr>
+        <w:t xml:space="preserve">(1), 49–71. https://doi.org/10.1080/03086530601143396</w:t>
       </w:r>
     </w:p>
     <w:p>
       <w:pPr>
-        <w:spacing w:after="80" w:line="264" w:lineRule="auto"/>
+        <w:spacing w:after="100" w:line="264" w:lineRule="auto"/>
+        <w:ind w:left="567" w:hanging="567"/>
       </w:pPr>
       <w:r>
         <w:rPr>
@@ -1245,7 +1537,1047 @@
           <w:i w:val="0"/>
           <w:color w:val="000000"/>
         </w:rPr>
-        <w:t xml:space="preserve">bpb, Anwerbestopp 1973. https://www.bpb.de/themen/migration-integration/anwerbeabkommen/43270/anwerbestopp-1973/</w:t>
+        <w:t xml:space="preserve">Smith, S. C. (2023). Transition of power: The problems of Britain’s post-imperial relationship with Malta, 1964–1971. </w:t>
+      </w:r>
+      <w:r>
+        <w:rPr>
+          <w:rFonts w:ascii="Times New Roman" w:hAnsi="Times New Roman" w:cs="Times New Roman"/>
+          <w:b w:val="0"/>
+          <w:i/>
+          <w:color w:val="000000"/>
+        </w:rPr>
+        <w:t xml:space="preserve">Contemporary British History, 37</w:t>
+      </w:r>
+      <w:r>
+        <w:rPr>
+          <w:rFonts w:ascii="Times New Roman" w:hAnsi="Times New Roman" w:cs="Times New Roman"/>
+          <w:b w:val="0"/>
+          <w:i w:val="0"/>
+          <w:color w:val="000000"/>
+        </w:rPr>
+        <w:t xml:space="preserve">(1), 27–62. https://doi.org/10.1080/13619462.2022.2113777</w:t>
+      </w:r>
+    </w:p>
+    <w:p>
+      <w:pPr>
+        <w:spacing w:after="100" w:line="264" w:lineRule="auto"/>
+        <w:ind w:left="567" w:hanging="567"/>
+      </w:pPr>
+      <w:r>
+        <w:rPr>
+          <w:rFonts w:ascii="Times New Roman" w:hAnsi="Times New Roman" w:cs="Times New Roman"/>
+          <w:b w:val="0"/>
+          <w:i w:val="0"/>
+          <w:color w:val="000000"/>
+        </w:rPr>
+        <w:t xml:space="preserve">Fenech, D. (1997). Malta’s external security. </w:t>
+      </w:r>
+      <w:r>
+        <w:rPr>
+          <w:rFonts w:ascii="Times New Roman" w:hAnsi="Times New Roman" w:cs="Times New Roman"/>
+          <w:b w:val="0"/>
+          <w:i/>
+          <w:color w:val="000000"/>
+        </w:rPr>
+        <w:t xml:space="preserve">GeoJournal, 41</w:t>
+      </w:r>
+      <w:r>
+        <w:rPr>
+          <w:rFonts w:ascii="Times New Roman" w:hAnsi="Times New Roman" w:cs="Times New Roman"/>
+          <w:b w:val="0"/>
+          <w:i w:val="0"/>
+          <w:color w:val="000000"/>
+        </w:rPr>
+        <w:t xml:space="preserve">(2), 153–163. https://doi.org/10.1023/A:1006888926016</w:t>
+      </w:r>
+    </w:p>
+    <w:p>
+      <w:pPr>
+        <w:spacing w:after="100" w:line="264" w:lineRule="auto"/>
+        <w:ind w:left="567" w:hanging="567"/>
+      </w:pPr>
+      <w:r>
+        <w:rPr>
+          <w:rFonts w:ascii="Times New Roman" w:hAnsi="Times New Roman" w:cs="Times New Roman"/>
+          <w:b w:val="0"/>
+          <w:i w:val="0"/>
+          <w:color w:val="000000"/>
+        </w:rPr>
+        <w:t xml:space="preserve">King, R. (1979). The Maltese migration cycle: An archival survey. </w:t>
+      </w:r>
+      <w:r>
+        <w:rPr>
+          <w:rFonts w:ascii="Times New Roman" w:hAnsi="Times New Roman" w:cs="Times New Roman"/>
+          <w:b w:val="0"/>
+          <w:i/>
+          <w:color w:val="000000"/>
+        </w:rPr>
+        <w:t xml:space="preserve">Area, 11</w:t>
+      </w:r>
+      <w:r>
+        <w:rPr>
+          <w:rFonts w:ascii="Times New Roman" w:hAnsi="Times New Roman" w:cs="Times New Roman"/>
+          <w:b w:val="0"/>
+          <w:i w:val="0"/>
+          <w:color w:val="000000"/>
+        </w:rPr>
+        <w:t xml:space="preserve">(3), 245–249. https://www.jstor.org/stable/20001477</w:t>
+      </w:r>
+    </w:p>
+    <w:p>
+      <w:pPr>
+        <w:spacing w:after="100" w:line="264" w:lineRule="auto"/>
+        <w:ind w:left="567" w:hanging="567"/>
+      </w:pPr>
+      <w:r>
+        <w:rPr>
+          <w:rFonts w:ascii="Times New Roman" w:hAnsi="Times New Roman" w:cs="Times New Roman"/>
+          <w:b w:val="0"/>
+          <w:i w:val="0"/>
+          <w:color w:val="000000"/>
+        </w:rPr>
+        <w:t xml:space="preserve">Ministry of Defence. (1957). </w:t>
+      </w:r>
+      <w:r>
+        <w:rPr>
+          <w:rFonts w:ascii="Times New Roman" w:hAnsi="Times New Roman" w:cs="Times New Roman"/>
+          <w:b w:val="0"/>
+          <w:i/>
+          <w:color w:val="000000"/>
+        </w:rPr>
+        <w:t xml:space="preserve">Defence: Outline of future policy</w:t>
+      </w:r>
+      <w:r>
+        <w:rPr>
+          <w:rFonts w:ascii="Times New Roman" w:hAnsi="Times New Roman" w:cs="Times New Roman"/>
+          <w:b w:val="0"/>
+          <w:i w:val="0"/>
+          <w:color w:val="000000"/>
+        </w:rPr>
+        <w:t xml:space="preserve"> (Cmnd. 124). Her Majesty’s Stationery Office.</w:t>
+      </w:r>
+    </w:p>
+    <w:p>
+      <w:pPr>
+        <w:spacing w:after="100" w:line="264" w:lineRule="auto"/>
+        <w:ind w:left="567" w:hanging="567"/>
+      </w:pPr>
+      <w:r>
+        <w:rPr>
+          <w:rFonts w:ascii="Times New Roman" w:hAnsi="Times New Roman" w:cs="Times New Roman"/>
+          <w:b w:val="0"/>
+          <w:i w:val="0"/>
+          <w:color w:val="000000"/>
+        </w:rPr>
+        <w:t xml:space="preserve">UK Parliament. (1956, March 26). </w:t>
+      </w:r>
+      <w:r>
+        <w:rPr>
+          <w:rFonts w:ascii="Times New Roman" w:hAnsi="Times New Roman" w:cs="Times New Roman"/>
+          <w:b w:val="0"/>
+          <w:i/>
+          <w:color w:val="000000"/>
+        </w:rPr>
+        <w:t xml:space="preserve">Malta (Round Table Conference)</w:t>
+      </w:r>
+      <w:r>
+        <w:rPr>
+          <w:rFonts w:ascii="Times New Roman" w:hAnsi="Times New Roman" w:cs="Times New Roman"/>
+          <w:b w:val="0"/>
+          <w:i w:val="0"/>
+          <w:color w:val="000000"/>
+        </w:rPr>
+        <w:t xml:space="preserve"> [House of Commons debate]. Hansard. https://api.parliament.uk/historic-hansard/commons/1956/mar/26/malta-round-table-conference</w:t>
+      </w:r>
+    </w:p>
+    <w:p>
+      <w:pPr>
+        <w:spacing w:after="100" w:line="264" w:lineRule="auto"/>
+        <w:ind w:left="567" w:hanging="567"/>
+      </w:pPr>
+      <w:r>
+        <w:rPr>
+          <w:rFonts w:ascii="Times New Roman" w:hAnsi="Times New Roman" w:cs="Times New Roman"/>
+          <w:b w:val="0"/>
+          <w:i w:val="0"/>
+          <w:color w:val="000000"/>
+        </w:rPr>
+        <w:t xml:space="preserve">Malta Independence Order 1964, SI 1964/1398 (UK). https://www.legislation.gov.uk/uksi/1964/1398/pdfs/uksi_19641398_en.pdf</w:t>
+      </w:r>
+    </w:p>
+    <w:p>
+      <w:pPr>
+        <w:spacing w:after="100" w:line="264" w:lineRule="auto"/>
+        <w:ind w:left="567" w:hanging="567"/>
+      </w:pPr>
+      <w:r>
+        <w:rPr>
+          <w:rFonts w:ascii="Times New Roman" w:hAnsi="Times New Roman" w:cs="Times New Roman"/>
+          <w:b w:val="0"/>
+          <w:i w:val="0"/>
+          <w:color w:val="000000"/>
+        </w:rPr>
+        <w:t xml:space="preserve">Office of the Historian. (2012a). Memorandum from Acting Secretary of State Johnson to President Nixon, December 28, 1972 (Document 251). In </w:t>
+      </w:r>
+      <w:r>
+        <w:rPr>
+          <w:rFonts w:ascii="Times New Roman" w:hAnsi="Times New Roman" w:cs="Times New Roman"/>
+          <w:b w:val="0"/>
+          <w:i/>
+          <w:color w:val="000000"/>
+        </w:rPr>
+        <w:t xml:space="preserve">Foreign relations of the United States, 1969–1976: Vol. XLI. Western Europe; NATO, 1969–1972</w:t>
+      </w:r>
+      <w:r>
+        <w:rPr>
+          <w:rFonts w:ascii="Times New Roman" w:hAnsi="Times New Roman" w:cs="Times New Roman"/>
+          <w:b w:val="0"/>
+          <w:i w:val="0"/>
+          <w:color w:val="000000"/>
+        </w:rPr>
+        <w:t xml:space="preserve">. U.S. Department of State. https://history.state.gov/historicaldocuments/frus1969-76v41/d251</w:t>
+      </w:r>
+    </w:p>
+    <w:p>
+      <w:pPr>
+        <w:spacing w:after="100" w:line="264" w:lineRule="auto"/>
+        <w:ind w:left="567" w:hanging="567"/>
+      </w:pPr>
+      <w:r>
+        <w:rPr>
+          <w:rFonts w:ascii="Times New Roman" w:hAnsi="Times New Roman" w:cs="Times New Roman"/>
+          <w:b w:val="0"/>
+          <w:i w:val="0"/>
+          <w:color w:val="000000"/>
+        </w:rPr>
+        <w:t xml:space="preserve">Office of the Historian. (2012b). Memorandum from Helmut Sonnenfeldt of the National Security Council staff to the President’s assistant for national security affairs (Kissinger), July 12, 1972 (Document 248). In </w:t>
+      </w:r>
+      <w:r>
+        <w:rPr>
+          <w:rFonts w:ascii="Times New Roman" w:hAnsi="Times New Roman" w:cs="Times New Roman"/>
+          <w:b w:val="0"/>
+          <w:i/>
+          <w:color w:val="000000"/>
+        </w:rPr>
+        <w:t xml:space="preserve">Foreign relations of the United States, 1969–1976: Vol. XLI. Western Europe; NATO, 1969–1972</w:t>
+      </w:r>
+      <w:r>
+        <w:rPr>
+          <w:rFonts w:ascii="Times New Roman" w:hAnsi="Times New Roman" w:cs="Times New Roman"/>
+          <w:b w:val="0"/>
+          <w:i w:val="0"/>
+          <w:color w:val="000000"/>
+        </w:rPr>
+        <w:t xml:space="preserve">. U.S. Department of State. https://history.state.gov/historicaldocuments/frus1969-76v41/d248</w:t>
+      </w:r>
+    </w:p>
+    <w:p>
+      <w:pPr>
+        <w:spacing w:after="100" w:line="264" w:lineRule="auto"/>
+        <w:ind w:left="567" w:hanging="567"/>
+      </w:pPr>
+      <w:r>
+        <w:rPr>
+          <w:rFonts w:ascii="Times New Roman" w:hAnsi="Times New Roman" w:cs="Times New Roman"/>
+          <w:b w:val="0"/>
+          <w:i w:val="0"/>
+          <w:color w:val="000000"/>
+        </w:rPr>
+        <w:t xml:space="preserve">Office of the Historian. (2012c). Memorandum from the President’s assistant for national security affairs (Kissinger) to President Nixon, March 11, 1972 (Document 247). In </w:t>
+      </w:r>
+      <w:r>
+        <w:rPr>
+          <w:rFonts w:ascii="Times New Roman" w:hAnsi="Times New Roman" w:cs="Times New Roman"/>
+          <w:b w:val="0"/>
+          <w:i/>
+          <w:color w:val="000000"/>
+        </w:rPr>
+        <w:t xml:space="preserve">Foreign relations of the United States, 1969–1976: Vol. XLI. Western Europe; NATO, 1969–1972</w:t>
+      </w:r>
+      <w:r>
+        <w:rPr>
+          <w:rFonts w:ascii="Times New Roman" w:hAnsi="Times New Roman" w:cs="Times New Roman"/>
+          <w:b w:val="0"/>
+          <w:i w:val="0"/>
+          <w:color w:val="000000"/>
+        </w:rPr>
+        <w:t xml:space="preserve">. U.S. Department of State. https://history.state.gov/historicaldocuments/frus1969-76v41/d247</w:t>
+      </w:r>
+    </w:p>
+    <w:p>
+      <w:pPr>
+        <w:spacing w:after="100" w:line="264" w:lineRule="auto"/>
+        <w:ind w:left="567" w:hanging="567"/>
+      </w:pPr>
+      <w:r>
+        <w:rPr>
+          <w:rFonts w:ascii="Times New Roman" w:hAnsi="Times New Roman" w:cs="Times New Roman"/>
+          <w:b w:val="0"/>
+          <w:i w:val="0"/>
+          <w:color w:val="000000"/>
+        </w:rPr>
+        <w:t xml:space="preserve">National Statistics Office Malta. (n.d.). </w:t>
+      </w:r>
+      <w:r>
+        <w:rPr>
+          <w:rFonts w:ascii="Times New Roman" w:hAnsi="Times New Roman" w:cs="Times New Roman"/>
+          <w:b w:val="0"/>
+          <w:i/>
+          <w:color w:val="000000"/>
+        </w:rPr>
+        <w:t xml:space="preserve">History of the census</w:t>
+      </w:r>
+      <w:r>
+        <w:rPr>
+          <w:rFonts w:ascii="Times New Roman" w:hAnsi="Times New Roman" w:cs="Times New Roman"/>
+          <w:b w:val="0"/>
+          <w:i w:val="0"/>
+          <w:color w:val="000000"/>
+        </w:rPr>
+        <w:t xml:space="preserve">. https://nso.gov.mt/history-of-the-census/</w:t>
+      </w:r>
+    </w:p>
+    <w:p>
+      <w:pPr>
+        <w:spacing w:after="100" w:line="264" w:lineRule="auto"/>
+        <w:ind w:left="567" w:hanging="567"/>
+      </w:pPr>
+      <w:r>
+        <w:rPr>
+          <w:rFonts w:ascii="Times New Roman" w:hAnsi="Times New Roman" w:cs="Times New Roman"/>
+          <w:b w:val="0"/>
+          <w:i w:val="0"/>
+          <w:color w:val="000000"/>
+        </w:rPr>
+        <w:t xml:space="preserve">Government of Malta. (n.d.). </w:t>
+      </w:r>
+      <w:r>
+        <w:rPr>
+          <w:rFonts w:ascii="Times New Roman" w:hAnsi="Times New Roman" w:cs="Times New Roman"/>
+          <w:b w:val="0"/>
+          <w:i/>
+          <w:color w:val="000000"/>
+        </w:rPr>
+        <w:t xml:space="preserve">Mr Dom Mintoff</w:t>
+      </w:r>
+      <w:r>
+        <w:rPr>
+          <w:rFonts w:ascii="Times New Roman" w:hAnsi="Times New Roman" w:cs="Times New Roman"/>
+          <w:b w:val="0"/>
+          <w:i w:val="0"/>
+          <w:color w:val="000000"/>
+        </w:rPr>
+        <w:t xml:space="preserve">. https://www.gov.mt/en/Government/Government%20of%20Malta/Prime%20Ministers%20of%20Malta/Pages/Mr-Dom-Mintoff.aspx</w:t>
+      </w:r>
+    </w:p>
+    <w:p>
+      <w:pPr>
+        <w:spacing w:after="100" w:line="264" w:lineRule="auto"/>
+        <w:ind w:left="567" w:hanging="567"/>
+      </w:pPr>
+      <w:r>
+        <w:rPr>
+          <w:rFonts w:ascii="Times New Roman" w:hAnsi="Times New Roman" w:cs="Times New Roman"/>
+          <w:b w:val="0"/>
+          <w:i w:val="0"/>
+          <w:color w:val="000000"/>
+        </w:rPr>
+        <w:t xml:space="preserve">The Gazette. (n.d.). </w:t>
+      </w:r>
+      <w:r>
+        <w:rPr>
+          <w:rFonts w:ascii="Times New Roman" w:hAnsi="Times New Roman" w:cs="Times New Roman"/>
+          <w:b w:val="0"/>
+          <w:i/>
+          <w:color w:val="000000"/>
+        </w:rPr>
+        <w:t xml:space="preserve">This month in history: Malta’s George Cross</w:t>
+      </w:r>
+      <w:r>
+        <w:rPr>
+          <w:rFonts w:ascii="Times New Roman" w:hAnsi="Times New Roman" w:cs="Times New Roman"/>
+          <w:b w:val="0"/>
+          <w:i w:val="0"/>
+          <w:color w:val="000000"/>
+        </w:rPr>
+        <w:t xml:space="preserve">. https://www.thegazette.co.uk/awards-and-accreditation/content/100008</w:t>
+      </w:r>
+    </w:p>
+    <w:p>
+      <w:pPr>
+        <w:spacing w:after="100" w:line="264" w:lineRule="auto"/>
+        <w:ind w:left="567" w:hanging="567"/>
+      </w:pPr>
+      <w:r>
+        <w:rPr>
+          <w:rFonts w:ascii="Times New Roman" w:hAnsi="Times New Roman" w:cs="Times New Roman"/>
+          <w:b w:val="0"/>
+          <w:i w:val="0"/>
+          <w:color w:val="000000"/>
+        </w:rPr>
+        <w:t xml:space="preserve">European Union. (n.d.). </w:t>
+      </w:r>
+      <w:r>
+        <w:rPr>
+          <w:rFonts w:ascii="Times New Roman" w:hAnsi="Times New Roman" w:cs="Times New Roman"/>
+          <w:b w:val="0"/>
+          <w:i/>
+          <w:color w:val="000000"/>
+        </w:rPr>
+        <w:t xml:space="preserve">Malta</w:t>
+      </w:r>
+      <w:r>
+        <w:rPr>
+          <w:rFonts w:ascii="Times New Roman" w:hAnsi="Times New Roman" w:cs="Times New Roman"/>
+          <w:b w:val="0"/>
+          <w:i w:val="0"/>
+          <w:color w:val="000000"/>
+        </w:rPr>
+        <w:t xml:space="preserve">. https://european-union.europa.eu/principles-countries-history/eu-countries/malta_en</w:t>
+      </w:r>
+    </w:p>
+    <w:p>
+      <w:pPr>
+        <w:spacing w:after="80" w:line="264" w:lineRule="auto" w:before="200"/>
+        <w:keepNext/>
+      </w:pPr>
+      <w:r>
+        <w:rPr>
+          <w:rFonts w:ascii="Times New Roman" w:hAnsi="Times New Roman" w:cs="Times New Roman"/>
+          <w:b/>
+          <w:i w:val="0"/>
+          <w:color w:val="000000"/>
+          <w:sz w:val="26"/>
+          <w:szCs w:val="26"/>
+        </w:rPr>
+        <w:t xml:space="preserve">Jamaica</w:t>
+      </w:r>
+    </w:p>
+    <w:p>
+      <w:pPr>
+        <w:spacing w:after="100" w:line="264" w:lineRule="auto"/>
+        <w:ind w:left="567" w:hanging="567"/>
+      </w:pPr>
+      <w:r>
+        <w:rPr>
+          <w:rFonts w:ascii="Times New Roman" w:hAnsi="Times New Roman" w:cs="Times New Roman"/>
+          <w:b w:val="0"/>
+          <w:i w:val="0"/>
+          <w:color w:val="000000"/>
+        </w:rPr>
+        <w:t xml:space="preserve">The National Archives. (n.d.). </w:t>
+      </w:r>
+      <w:r>
+        <w:rPr>
+          <w:rFonts w:ascii="Times New Roman" w:hAnsi="Times New Roman" w:cs="Times New Roman"/>
+          <w:b w:val="0"/>
+          <w:i/>
+          <w:color w:val="000000"/>
+        </w:rPr>
+        <w:t xml:space="preserve">Postwar Caribbean migration</w:t>
+      </w:r>
+      <w:r>
+        <w:rPr>
+          <w:rFonts w:ascii="Times New Roman" w:hAnsi="Times New Roman" w:cs="Times New Roman"/>
+          <w:b w:val="0"/>
+          <w:i w:val="0"/>
+          <w:color w:val="000000"/>
+        </w:rPr>
+        <w:t xml:space="preserve">. https://www.nationalarchives.gov.uk/explore-the-collection/explore-by-time-period/postwar/postwar-caribbean-migration/</w:t>
+      </w:r>
+    </w:p>
+    <w:p>
+      <w:pPr>
+        <w:spacing w:after="100" w:line="264" w:lineRule="auto"/>
+        <w:ind w:left="567" w:hanging="567"/>
+      </w:pPr>
+      <w:r>
+        <w:rPr>
+          <w:rFonts w:ascii="Times New Roman" w:hAnsi="Times New Roman" w:cs="Times New Roman"/>
+          <w:b w:val="0"/>
+          <w:i w:val="0"/>
+          <w:color w:val="000000"/>
+        </w:rPr>
+        <w:t xml:space="preserve">UK Parliament. (1962, April 19). </w:t>
+      </w:r>
+      <w:r>
+        <w:rPr>
+          <w:rFonts w:ascii="Times New Roman" w:hAnsi="Times New Roman" w:cs="Times New Roman"/>
+          <w:b w:val="0"/>
+          <w:i/>
+          <w:color w:val="000000"/>
+        </w:rPr>
+        <w:t xml:space="preserve">Commonwealth Immigrants Act</w:t>
+      </w:r>
+      <w:r>
+        <w:rPr>
+          <w:rFonts w:ascii="Times New Roman" w:hAnsi="Times New Roman" w:cs="Times New Roman"/>
+          <w:b w:val="0"/>
+          <w:i w:val="0"/>
+          <w:color w:val="000000"/>
+        </w:rPr>
+        <w:t xml:space="preserve"> [Written answers]. Hansard. https://api.parliament.uk/historic-hansard/written-answers/1962/apr/19/commonwealth-immigrants-act</w:t>
+      </w:r>
+    </w:p>
+    <w:p>
+      <w:pPr>
+        <w:spacing w:after="100" w:line="264" w:lineRule="auto"/>
+        <w:ind w:left="567" w:hanging="567"/>
+      </w:pPr>
+      <w:r>
+        <w:rPr>
+          <w:rFonts w:ascii="Times New Roman" w:hAnsi="Times New Roman" w:cs="Times New Roman"/>
+          <w:b w:val="0"/>
+          <w:i w:val="0"/>
+          <w:color w:val="000000"/>
+        </w:rPr>
+        <w:t xml:space="preserve">Jamaica Independence Act 1962, 10 &amp; 11 Eliz. 2 c. 40 (UK). https://www.legislation.gov.uk/ukpga/Eliz2/10-11/40/enacted</w:t>
+      </w:r>
+    </w:p>
+    <w:p>
+      <w:pPr>
+        <w:spacing w:after="100" w:line="264" w:lineRule="auto"/>
+        <w:ind w:left="567" w:hanging="567"/>
+      </w:pPr>
+      <w:r>
+        <w:rPr>
+          <w:rFonts w:ascii="Times New Roman" w:hAnsi="Times New Roman" w:cs="Times New Roman"/>
+          <w:b w:val="0"/>
+          <w:i w:val="0"/>
+          <w:color w:val="000000"/>
+        </w:rPr>
+        <w:t xml:space="preserve">Canadian Museum of Immigration at Pier 21. (n.d.). </w:t>
+      </w:r>
+      <w:r>
+        <w:rPr>
+          <w:rFonts w:ascii="Times New Roman" w:hAnsi="Times New Roman" w:cs="Times New Roman"/>
+          <w:b w:val="0"/>
+          <w:i/>
+          <w:color w:val="000000"/>
+        </w:rPr>
+        <w:t xml:space="preserve">Immigration regulations, Order-in-Council PC 1962-86, 1962</w:t>
+      </w:r>
+      <w:r>
+        <w:rPr>
+          <w:rFonts w:ascii="Times New Roman" w:hAnsi="Times New Roman" w:cs="Times New Roman"/>
+          <w:b w:val="0"/>
+          <w:i w:val="0"/>
+          <w:color w:val="000000"/>
+        </w:rPr>
+        <w:t xml:space="preserve">. https://pier21.ca/research/immigration-history/immigration-regulations-order-in-council-pc-1962-86-1962</w:t>
+      </w:r>
+    </w:p>
+    <w:p>
+      <w:pPr>
+        <w:spacing w:after="100" w:line="264" w:lineRule="auto"/>
+        <w:ind w:left="567" w:hanging="567"/>
+      </w:pPr>
+      <w:r>
+        <w:rPr>
+          <w:rFonts w:ascii="Times New Roman" w:hAnsi="Times New Roman" w:cs="Times New Roman"/>
+          <w:b w:val="0"/>
+          <w:i w:val="0"/>
+          <w:color w:val="000000"/>
+        </w:rPr>
+        <w:t xml:space="preserve">Organization of American States. (n.d.). </w:t>
+      </w:r>
+      <w:r>
+        <w:rPr>
+          <w:rFonts w:ascii="Times New Roman" w:hAnsi="Times New Roman" w:cs="Times New Roman"/>
+          <w:b w:val="0"/>
+          <w:i/>
+          <w:color w:val="000000"/>
+        </w:rPr>
+        <w:t xml:space="preserve">Jamaica</w:t>
+      </w:r>
+      <w:r>
+        <w:rPr>
+          <w:rFonts w:ascii="Times New Roman" w:hAnsi="Times New Roman" w:cs="Times New Roman"/>
+          <w:b w:val="0"/>
+          <w:i w:val="0"/>
+          <w:color w:val="000000"/>
+        </w:rPr>
+        <w:t xml:space="preserve">. Migration at the OAS. https://www.migracionoea.org/jamaica/</w:t>
+      </w:r>
+    </w:p>
+    <w:p>
+      <w:pPr>
+        <w:spacing w:after="100" w:line="264" w:lineRule="auto"/>
+        <w:ind w:left="567" w:hanging="567"/>
+      </w:pPr>
+      <w:r>
+        <w:rPr>
+          <w:rFonts w:ascii="Times New Roman" w:hAnsi="Times New Roman" w:cs="Times New Roman"/>
+          <w:b w:val="0"/>
+          <w:i w:val="0"/>
+          <w:color w:val="000000"/>
+        </w:rPr>
+        <w:t xml:space="preserve">Glennie, A., &amp; Chappell, L. (2010, June 16). </w:t>
+      </w:r>
+      <w:r>
+        <w:rPr>
+          <w:rFonts w:ascii="Times New Roman" w:hAnsi="Times New Roman" w:cs="Times New Roman"/>
+          <w:b w:val="0"/>
+          <w:i/>
+          <w:color w:val="000000"/>
+        </w:rPr>
+        <w:t xml:space="preserve">Jamaica: From diverse beginning to diaspora in the developed world</w:t>
+      </w:r>
+      <w:r>
+        <w:rPr>
+          <w:rFonts w:ascii="Times New Roman" w:hAnsi="Times New Roman" w:cs="Times New Roman"/>
+          <w:b w:val="0"/>
+          <w:i w:val="0"/>
+          <w:color w:val="000000"/>
+        </w:rPr>
+        <w:t xml:space="preserve">. Migration Policy Institute. https://www.migrationpolicy.org/article/jamaica-diverse-beginning-diaspora-developed-world</w:t>
+      </w:r>
+    </w:p>
+    <w:p>
+      <w:pPr>
+        <w:spacing w:after="100" w:line="264" w:lineRule="auto"/>
+        <w:ind w:left="567" w:hanging="567"/>
+      </w:pPr>
+      <w:r>
+        <w:rPr>
+          <w:rFonts w:ascii="Times New Roman" w:hAnsi="Times New Roman" w:cs="Times New Roman"/>
+          <w:b w:val="0"/>
+          <w:i w:val="0"/>
+          <w:color w:val="000000"/>
+        </w:rPr>
+        <w:t xml:space="preserve">Ramocan, E. G. (2011). </w:t>
+      </w:r>
+      <w:r>
+        <w:rPr>
+          <w:rFonts w:ascii="Times New Roman" w:hAnsi="Times New Roman" w:cs="Times New Roman"/>
+          <w:b w:val="0"/>
+          <w:i/>
+          <w:color w:val="000000"/>
+        </w:rPr>
+        <w:t xml:space="preserve">Remittances to Jamaica: Findings from a national survey of remittance recipients</w:t>
+      </w:r>
+      <w:r>
+        <w:rPr>
+          <w:rFonts w:ascii="Times New Roman" w:hAnsi="Times New Roman" w:cs="Times New Roman"/>
+          <w:b w:val="0"/>
+          <w:i w:val="0"/>
+          <w:color w:val="000000"/>
+        </w:rPr>
+        <w:t xml:space="preserve">. Bank of Jamaica. https://www.boj.org.jm/uploads/pdf/papers_pamphlets/papers_pamphlets_Remittances_to_Jamaica_-_Findings_from_a_National_Survey_of_Remittance_Recipients.pdf</w:t>
+      </w:r>
+    </w:p>
+    <w:p>
+      <w:pPr>
+        <w:spacing w:after="80" w:line="264" w:lineRule="auto" w:before="200"/>
+        <w:keepNext/>
+      </w:pPr>
+      <w:r>
+        <w:rPr>
+          <w:rFonts w:ascii="Times New Roman" w:hAnsi="Times New Roman" w:cs="Times New Roman"/>
+          <w:b/>
+          <w:i w:val="0"/>
+          <w:color w:val="000000"/>
+          <w:sz w:val="26"/>
+          <w:szCs w:val="26"/>
+        </w:rPr>
+        <w:t xml:space="preserve">West Germany and the recruitment agreements</w:t>
+      </w:r>
+    </w:p>
+    <w:p>
+      <w:pPr>
+        <w:spacing w:after="100" w:line="264" w:lineRule="auto"/>
+        <w:ind w:left="567" w:hanging="567"/>
+      </w:pPr>
+      <w:r>
+        <w:rPr>
+          <w:rFonts w:ascii="Times New Roman" w:hAnsi="Times New Roman" w:cs="Times New Roman"/>
+          <w:b w:val="0"/>
+          <w:i w:val="0"/>
+          <w:color w:val="000000"/>
+        </w:rPr>
+        <w:t xml:space="preserve">Bundeszentrale für politische Bildung. (2020, December 17). </w:t>
+      </w:r>
+      <w:r>
+        <w:rPr>
+          <w:rFonts w:ascii="Times New Roman" w:hAnsi="Times New Roman" w:cs="Times New Roman"/>
+          <w:b w:val="0"/>
+          <w:i/>
+          <w:color w:val="000000"/>
+        </w:rPr>
+        <w:t xml:space="preserve">Erstes Anwerbeabkommen vor 65 Jahren</w:t>
+      </w:r>
+      <w:r>
+        <w:rPr>
+          <w:rFonts w:ascii="Times New Roman" w:hAnsi="Times New Roman" w:cs="Times New Roman"/>
+          <w:b w:val="0"/>
+          <w:i w:val="0"/>
+          <w:color w:val="000000"/>
+        </w:rPr>
+        <w:t xml:space="preserve"> [The first recruitment agreement 65 years ago]. https://www.bpb.de/kurz-knapp/hintergrund-aktuell/324552/erstes-anwerbeabkommen-vor-65-jahren/</w:t>
+      </w:r>
+    </w:p>
+    <w:p>
+      <w:pPr>
+        <w:spacing w:after="100" w:line="264" w:lineRule="auto"/>
+        <w:ind w:left="567" w:hanging="567"/>
+      </w:pPr>
+      <w:r>
+        <w:rPr>
+          <w:rFonts w:ascii="Times New Roman" w:hAnsi="Times New Roman" w:cs="Times New Roman"/>
+          <w:b w:val="0"/>
+          <w:i w:val="0"/>
+          <w:color w:val="000000"/>
+        </w:rPr>
+        <w:t xml:space="preserve">Bundeszentrale für politische Bildung. (2011, November 9). </w:t>
+      </w:r>
+      <w:r>
+        <w:rPr>
+          <w:rFonts w:ascii="Times New Roman" w:hAnsi="Times New Roman" w:cs="Times New Roman"/>
+          <w:b w:val="0"/>
+          <w:i/>
+          <w:color w:val="000000"/>
+        </w:rPr>
+        <w:t xml:space="preserve">Anwerbestopp 1973</w:t>
+      </w:r>
+      <w:r>
+        <w:rPr>
+          <w:rFonts w:ascii="Times New Roman" w:hAnsi="Times New Roman" w:cs="Times New Roman"/>
+          <w:b w:val="0"/>
+          <w:i w:val="0"/>
+          <w:color w:val="000000"/>
+        </w:rPr>
+        <w:t xml:space="preserve"> [The 1973 recruitment stop]. https://www.bpb.de/themen/migration-integration/anwerbeabkommen/43270/anwerbestopp-1973/</w:t>
+      </w:r>
+    </w:p>
+    <w:p>
+      <w:pPr>
+        <w:spacing w:after="100" w:line="264" w:lineRule="auto"/>
+        <w:ind w:left="567" w:hanging="567"/>
+      </w:pPr>
+      <w:r>
+        <w:rPr>
+          <w:rFonts w:ascii="Times New Roman" w:hAnsi="Times New Roman" w:cs="Times New Roman"/>
+          <w:b w:val="0"/>
+          <w:i w:val="0"/>
+          <w:color w:val="000000"/>
+        </w:rPr>
+        <w:t xml:space="preserve">Luft, S. (2014, August 5). </w:t>
+      </w:r>
+      <w:r>
+        <w:rPr>
+          <w:rFonts w:ascii="Times New Roman" w:hAnsi="Times New Roman" w:cs="Times New Roman"/>
+          <w:b w:val="0"/>
+          <w:i/>
+          <w:color w:val="000000"/>
+        </w:rPr>
+        <w:t xml:space="preserve">Die Anwerbung türkischer Arbeitnehmer und ihre Folgen</w:t>
+      </w:r>
+      <w:r>
+        <w:rPr>
+          <w:rFonts w:ascii="Times New Roman" w:hAnsi="Times New Roman" w:cs="Times New Roman"/>
+          <w:b w:val="0"/>
+          <w:i w:val="0"/>
+          <w:color w:val="000000"/>
+        </w:rPr>
+        <w:t xml:space="preserve"> [The recruitment of Turkish workers and its consequences]. Bundeszentrale für politische Bildung. https://www.bpb.de/themen/europa/tuerkei/184981/die-anwerbung-tuerkischer-arbeitnehmer-und-ihre-folgen/</w:t>
+      </w:r>
+    </w:p>
+    <w:p>
+      <w:pPr>
+        <w:spacing w:after="80" w:line="264" w:lineRule="auto" w:before="200"/>
+        <w:keepNext/>
+      </w:pPr>
+      <w:r>
+        <w:rPr>
+          <w:rFonts w:ascii="Times New Roman" w:hAnsi="Times New Roman" w:cs="Times New Roman"/>
+          <w:b/>
+          <w:i w:val="0"/>
+          <w:color w:val="000000"/>
+          <w:sz w:val="26"/>
+          <w:szCs w:val="26"/>
+        </w:rPr>
+        <w:t xml:space="preserve">Small states: further reading</w:t>
+      </w:r>
+    </w:p>
+    <w:p>
+      <w:pPr>
+        <w:spacing w:after="100" w:line="264" w:lineRule="auto"/>
+        <w:ind w:left="567" w:hanging="567"/>
+      </w:pPr>
+      <w:r>
+        <w:rPr>
+          <w:rFonts w:ascii="Times New Roman" w:hAnsi="Times New Roman" w:cs="Times New Roman"/>
+          <w:b w:val="0"/>
+          <w:i w:val="0"/>
+          <w:color w:val="000000"/>
+        </w:rPr>
+        <w:t xml:space="preserve">Bertram, I. G., &amp; Watters, R. F. (1985). The MIRAB economy in South Pacific microstates. </w:t>
+      </w:r>
+      <w:r>
+        <w:rPr>
+          <w:rFonts w:ascii="Times New Roman" w:hAnsi="Times New Roman" w:cs="Times New Roman"/>
+          <w:b w:val="0"/>
+          <w:i/>
+          <w:color w:val="000000"/>
+        </w:rPr>
+        <w:t xml:space="preserve">Pacific Viewpoint, 26</w:t>
+      </w:r>
+      <w:r>
+        <w:rPr>
+          <w:rFonts w:ascii="Times New Roman" w:hAnsi="Times New Roman" w:cs="Times New Roman"/>
+          <w:b w:val="0"/>
+          <w:i w:val="0"/>
+          <w:color w:val="000000"/>
+        </w:rPr>
+        <w:t xml:space="preserve">(3), 497–519. https://doi.org/10.1111/apv.263002</w:t>
+      </w:r>
+    </w:p>
+    <w:p>
+      <w:pPr>
+        <w:spacing w:after="100" w:line="264" w:lineRule="auto"/>
+        <w:ind w:left="567" w:hanging="567"/>
+      </w:pPr>
+      <w:r>
+        <w:rPr>
+          <w:rFonts w:ascii="Times New Roman" w:hAnsi="Times New Roman" w:cs="Times New Roman"/>
+          <w:b w:val="0"/>
+          <w:i w:val="0"/>
+          <w:color w:val="000000"/>
+        </w:rPr>
+        <w:t xml:space="preserve">Katzenstein, P. J. (1985). </w:t>
+      </w:r>
+      <w:r>
+        <w:rPr>
+          <w:rFonts w:ascii="Times New Roman" w:hAnsi="Times New Roman" w:cs="Times New Roman"/>
+          <w:b w:val="0"/>
+          <w:i/>
+          <w:color w:val="000000"/>
+        </w:rPr>
+        <w:t xml:space="preserve">Small states in world markets: Industrial policy in Europe</w:t>
+      </w:r>
+      <w:r>
+        <w:rPr>
+          <w:rFonts w:ascii="Times New Roman" w:hAnsi="Times New Roman" w:cs="Times New Roman"/>
+          <w:b w:val="0"/>
+          <w:i w:val="0"/>
+          <w:color w:val="000000"/>
+        </w:rPr>
+        <w:t xml:space="preserve">. Cornell University Press.</w:t>
+      </w:r>
+    </w:p>
+    <w:p>
+      <w:pPr>
+        <w:spacing w:after="100" w:line="264" w:lineRule="auto"/>
+        <w:ind w:left="567" w:hanging="567"/>
+      </w:pPr>
+      <w:r>
+        <w:rPr>
+          <w:rFonts w:ascii="Times New Roman" w:hAnsi="Times New Roman" w:cs="Times New Roman"/>
+          <w:b w:val="0"/>
+          <w:i w:val="0"/>
+          <w:color w:val="000000"/>
+        </w:rPr>
+        <w:t xml:space="preserve">Baldacchino, G. (2006). Innovative development strategies from non-sovereign island jurisdictions? A global review of economic policy and governance practices. </w:t>
+      </w:r>
+      <w:r>
+        <w:rPr>
+          <w:rFonts w:ascii="Times New Roman" w:hAnsi="Times New Roman" w:cs="Times New Roman"/>
+          <w:b w:val="0"/>
+          <w:i/>
+          <w:color w:val="000000"/>
+        </w:rPr>
+        <w:t xml:space="preserve">World Development, 34</w:t>
+      </w:r>
+      <w:r>
+        <w:rPr>
+          <w:rFonts w:ascii="Times New Roman" w:hAnsi="Times New Roman" w:cs="Times New Roman"/>
+          <w:b w:val="0"/>
+          <w:i w:val="0"/>
+          <w:color w:val="000000"/>
+        </w:rPr>
+        <w:t xml:space="preserve">(5), 852–867. https://doi.org/10.1016/j.worlddev.2005.10.004</w:t>
+      </w:r>
+    </w:p>
+    <w:p>
+      <w:pPr>
+        <w:spacing w:after="80" w:line="264" w:lineRule="auto" w:before="200"/>
+        <w:keepNext/>
+      </w:pPr>
+      <w:r>
+        <w:rPr>
+          <w:rFonts w:ascii="Times New Roman" w:hAnsi="Times New Roman" w:cs="Times New Roman"/>
+          <w:b/>
+          <w:i w:val="0"/>
+          <w:color w:val="000000"/>
+          <w:sz w:val="26"/>
+          <w:szCs w:val="26"/>
+        </w:rPr>
+        <w:t xml:space="preserve">Data</w:t>
+      </w:r>
+    </w:p>
+    <w:p>
+      <w:pPr>
+        <w:spacing w:after="100" w:line="264" w:lineRule="auto"/>
+        <w:ind w:left="567" w:hanging="567"/>
+      </w:pPr>
+      <w:r>
+        <w:rPr>
+          <w:rFonts w:ascii="Times New Roman" w:hAnsi="Times New Roman" w:cs="Times New Roman"/>
+          <w:b w:val="0"/>
+          <w:i w:val="0"/>
+          <w:color w:val="000000"/>
+        </w:rPr>
+        <w:t xml:space="preserve">World Bank. (n.d.). </w:t>
+      </w:r>
+      <w:r>
+        <w:rPr>
+          <w:rFonts w:ascii="Times New Roman" w:hAnsi="Times New Roman" w:cs="Times New Roman"/>
+          <w:b w:val="0"/>
+          <w:i/>
+          <w:color w:val="000000"/>
+        </w:rPr>
+        <w:t xml:space="preserve">Personal remittances, received (% of GDP): Malta, Jamaica</w:t>
+      </w:r>
+      <w:r>
+        <w:rPr>
+          <w:rFonts w:ascii="Times New Roman" w:hAnsi="Times New Roman" w:cs="Times New Roman"/>
+          <w:b w:val="0"/>
+          <w:i w:val="0"/>
+          <w:color w:val="000000"/>
+        </w:rPr>
+        <w:t xml:space="preserve"> [Data set]. World Development Indicators. Retrieved September 17, 2026, from https://data.worldbank.org/indicator/BX.TRF.PWKR.DT.GD.ZS?locations=MT-JM</w:t>
+      </w:r>
+    </w:p>
+    <w:p>
+      <w:pPr>
+        <w:spacing w:after="100" w:line="264" w:lineRule="auto"/>
+        <w:ind w:left="567" w:hanging="567"/>
+      </w:pPr>
+      <w:r>
+        <w:rPr>
+          <w:rFonts w:ascii="Times New Roman" w:hAnsi="Times New Roman" w:cs="Times New Roman"/>
+          <w:b w:val="0"/>
+          <w:i w:val="0"/>
+          <w:color w:val="000000"/>
+        </w:rPr>
+        <w:t xml:space="preserve">World Bank. (n.d.). </w:t>
+      </w:r>
+      <w:r>
+        <w:rPr>
+          <w:rFonts w:ascii="Times New Roman" w:hAnsi="Times New Roman" w:cs="Times New Roman"/>
+          <w:b w:val="0"/>
+          <w:i/>
+          <w:color w:val="000000"/>
+        </w:rPr>
+        <w:t xml:space="preserve">Personal remittances, received (current US$): Jamaica</w:t>
+      </w:r>
+      <w:r>
+        <w:rPr>
+          <w:rFonts w:ascii="Times New Roman" w:hAnsi="Times New Roman" w:cs="Times New Roman"/>
+          <w:b w:val="0"/>
+          <w:i w:val="0"/>
+          <w:color w:val="000000"/>
+        </w:rPr>
+        <w:t xml:space="preserve"> [Data set]. World Development Indicators. Retrieved September 17, 2026, from https://data.worldbank.org/indicator/BX.TRF.PWKR.CD.DT?locations=JM</w:t>
+      </w:r>
+    </w:p>
+    <w:p>
+      <w:pPr>
+        <w:spacing w:after="100" w:line="264" w:lineRule="auto"/>
+        <w:ind w:left="567" w:hanging="567"/>
+      </w:pPr>
+      <w:r>
+        <w:rPr>
+          <w:rFonts w:ascii="Times New Roman" w:hAnsi="Times New Roman" w:cs="Times New Roman"/>
+          <w:b w:val="0"/>
+          <w:i w:val="0"/>
+          <w:color w:val="000000"/>
+        </w:rPr>
+        <w:t xml:space="preserve">World Bank. (n.d.). </w:t>
+      </w:r>
+      <w:r>
+        <w:rPr>
+          <w:rFonts w:ascii="Times New Roman" w:hAnsi="Times New Roman" w:cs="Times New Roman"/>
+          <w:b w:val="0"/>
+          <w:i/>
+          <w:color w:val="000000"/>
+        </w:rPr>
+        <w:t xml:space="preserve">GDP growth (annual %): Jamaica</w:t>
+      </w:r>
+      <w:r>
+        <w:rPr>
+          <w:rFonts w:ascii="Times New Roman" w:hAnsi="Times New Roman" w:cs="Times New Roman"/>
+          <w:b w:val="0"/>
+          <w:i w:val="0"/>
+          <w:color w:val="000000"/>
+        </w:rPr>
+        <w:t xml:space="preserve"> [Data set]. World Development Indicators. Retrieved September 17, 2026, from https://data.worldbank.org/indicator/NY.GDP.MKTP.KD.ZG?locations=JM</w:t>
+      </w:r>
+    </w:p>
+    <w:p>
+      <w:pPr>
+        <w:spacing w:after="100" w:line="264" w:lineRule="auto"/>
+        <w:ind w:left="567" w:hanging="567"/>
+      </w:pPr>
+      <w:r>
+        <w:rPr>
+          <w:rFonts w:ascii="Times New Roman" w:hAnsi="Times New Roman" w:cs="Times New Roman"/>
+          <w:b w:val="0"/>
+          <w:i w:val="0"/>
+          <w:color w:val="000000"/>
+        </w:rPr>
+        <w:t xml:space="preserve">World Bank. (n.d.). </w:t>
+      </w:r>
+      <w:r>
+        <w:rPr>
+          <w:rFonts w:ascii="Times New Roman" w:hAnsi="Times New Roman" w:cs="Times New Roman"/>
+          <w:b w:val="0"/>
+          <w:i/>
+          <w:color w:val="000000"/>
+        </w:rPr>
+        <w:t xml:space="preserve">Net ODA received (% of GNI): Malta</w:t>
+      </w:r>
+      <w:r>
+        <w:rPr>
+          <w:rFonts w:ascii="Times New Roman" w:hAnsi="Times New Roman" w:cs="Times New Roman"/>
+          <w:b w:val="0"/>
+          <w:i w:val="0"/>
+          <w:color w:val="000000"/>
+        </w:rPr>
+        <w:t xml:space="preserve"> [Data set]. World Development Indicators. Retrieved September 17, 2026, from https://data.worldbank.org/indicator/DT.ODA.ODAT.GN.ZS?locations=MT</w:t>
+      </w:r>
+    </w:p>
+    <w:p>
+      <w:pPr>
+        <w:spacing w:after="100" w:line="264" w:lineRule="auto"/>
+        <w:ind w:left="567" w:hanging="567"/>
+      </w:pPr>
+      <w:r>
+        <w:rPr>
+          <w:rFonts w:ascii="Times New Roman" w:hAnsi="Times New Roman" w:cs="Times New Roman"/>
+          <w:b w:val="0"/>
+          <w:i w:val="0"/>
+          <w:color w:val="000000"/>
+        </w:rPr>
+        <w:t xml:space="preserve">World Bank. (n.d.). </w:t>
+      </w:r>
+      <w:r>
+        <w:rPr>
+          <w:rFonts w:ascii="Times New Roman" w:hAnsi="Times New Roman" w:cs="Times New Roman"/>
+          <w:b w:val="0"/>
+          <w:i/>
+          <w:color w:val="000000"/>
+        </w:rPr>
+        <w:t xml:space="preserve">Population, total: Türkiye</w:t>
+      </w:r>
+      <w:r>
+        <w:rPr>
+          <w:rFonts w:ascii="Times New Roman" w:hAnsi="Times New Roman" w:cs="Times New Roman"/>
+          <w:b w:val="0"/>
+          <w:i w:val="0"/>
+          <w:color w:val="000000"/>
+        </w:rPr>
+        <w:t xml:space="preserve"> [Data set]. World Development Indicators. Retrieved September 17, 2026, from https://data.worldbank.org/indicator/SP.POP.TOTL?locations=TR</w:t>
       </w:r>
     </w:p>
     <w:sectPr>

</xml_diff>